<commit_message>
ready docx protocol save
</commit_message>
<xml_diff>
--- a/protocol_generated.docx
+++ b/protocol_generated.docx
@@ -54,7 +54,7 @@
           <w:b/>
           <w:bCs/>
         </w:rPr>
-        <w:t xml:space="preserve">№ 17 </w:t>
+        <w:t xml:space="preserve">№ 1 </w:t>
       </w:r>
       <w:r>
         <w:rPr>
@@ -62,7 +62,7 @@
           <w:b/>
           <w:bCs/>
         </w:rPr>
-        <w:t>от 20.04.2026 г.</w:t>
+        <w:t>от 25.04.2026 г.</w:t>
       </w:r>
       <w:r>
         <w:rPr>
@@ -98,14 +98,13 @@
         <w:rPr>
           <w:rFonts w:ascii="Times New Roman" w:hAnsi="Times New Roman" w:cs="Times New Roman"/>
         </w:rPr>
-        <w:t>сварных стыков магистрального трубопровода, стоящего по адресу:</w:t>
+        <w:t>сварных стыков магистрального трубопровода высокого давления, стоящего по адресу:</w:t>
       </w:r>
       <w:r>
         <w:rPr>
           <w:rFonts w:ascii="Times New Roman" w:hAnsi="Times New Roman" w:cs="Times New Roman"/>
         </w:rPr>
         <w:br/>
-        <w:t>г. Москва, ул. 7-я Парковая, 9/26</w:t>
       </w:r>
     </w:p>
     <w:p>
@@ -119,7 +118,6 @@
         <w:rPr>
           <w:rFonts w:ascii="Times New Roman" w:hAnsi="Times New Roman" w:cs="Times New Roman"/>
         </w:rPr>
-        <w:t>Газопровод сварен из P.</w:t>
       </w:r>
       <w:r>
         <w:rPr>
@@ -514,7 +512,6 @@
                 <w:szCs w:val="22"/>
                 <w:lang w:val="en-US"/>
               </w:rPr>
-              <w:t>C1 1</w:t>
             </w:r>
           </w:p>
         </w:tc>
@@ -539,7 +536,6 @@
                 <w:szCs w:val="22"/>
                 <w:lang w:val="en-US"/>
               </w:rPr>
-              <w:t>1 300x100</w:t>
             </w:r>
           </w:p>
         </w:tc>
@@ -564,7 +560,6 @@
                 <w:szCs w:val="22"/>
                 <w:lang w:val="en-US"/>
               </w:rPr>
-              <w:t>56</w:t>
             </w:r>
           </w:p>
         </w:tc>
@@ -588,7 +583,6 @@
                 <w:szCs w:val="22"/>
                 <w:lang w:val="en-US"/>
               </w:rPr>
-              <w:t>0,4</w:t>
             </w:r>
             <w:r>
               <w:rPr>
@@ -618,7 +612,6 @@
                 <w:sz w:val="22"/>
                 <w:szCs w:val="22"/>
               </w:rPr>
-              <w:t>0,2</w:t>
             </w:r>
           </w:p>
         </w:tc>
@@ -640,7 +633,7 @@
                 <w:sz w:val="22"/>
                 <w:szCs w:val="22"/>
               </w:rPr>
-              <w:t>ШК1,5х0,8</w:t>
+              <w:t>П2,5</w:t>
             </w:r>
           </w:p>
         </w:tc>
@@ -663,7 +656,6 @@
                 <w:sz w:val="22"/>
                 <w:szCs w:val="22"/>
               </w:rPr>
-              <w:t>8</w:t>
             </w:r>
           </w:p>
         </w:tc>
@@ -680,9 +672,7 @@
                 <w:szCs w:val="22"/>
               </w:rPr>
             </w:pPr>
-            <w:r>
-              <w:t>5</w:t>
-            </w:r>
+            <w:r/>
           </w:p>
         </w:tc>
         <w:tc>
@@ -703,7 +693,6 @@
                 <w:sz w:val="22"/>
                 <w:szCs w:val="22"/>
               </w:rPr>
-              <w:t>годен</w:t>
             </w:r>
           </w:p>
         </w:tc>
@@ -726,7 +715,6 @@
                 <w:sz w:val="22"/>
                 <w:szCs w:val="22"/>
               </w:rPr>
-              <w:t>100</w:t>
             </w:r>
           </w:p>
         </w:tc>
@@ -748,7 +736,6 @@
                 <w:sz w:val="22"/>
                 <w:szCs w:val="22"/>
               </w:rPr>
-              <w:t>Примечание 1</w:t>
             </w:r>
           </w:p>
         </w:tc>
@@ -774,7 +761,6 @@
                 <w:szCs w:val="22"/>
                 <w:lang w:val="en-US"/>
               </w:rPr>
-              <w:t>C1 1</w:t>
             </w:r>
           </w:p>
         </w:tc>
@@ -799,7 +785,6 @@
                 <w:szCs w:val="22"/>
                 <w:lang w:val="en-US"/>
               </w:rPr>
-              <w:t>1 300x100</w:t>
             </w:r>
           </w:p>
         </w:tc>
@@ -824,7 +809,6 @@
                 <w:szCs w:val="22"/>
                 <w:lang w:val="en-US"/>
               </w:rPr>
-              <w:t>56</w:t>
             </w:r>
           </w:p>
         </w:tc>
@@ -848,7 +832,6 @@
                 <w:szCs w:val="22"/>
                 <w:lang w:val="en-US"/>
               </w:rPr>
-              <w:t>0,4</w:t>
             </w:r>
             <w:r>
               <w:rPr>
@@ -878,7 +861,6 @@
                 <w:sz w:val="22"/>
                 <w:szCs w:val="22"/>
               </w:rPr>
-              <w:t>0,2</w:t>
             </w:r>
           </w:p>
         </w:tc>
@@ -900,7 +882,7 @@
                 <w:sz w:val="22"/>
                 <w:szCs w:val="22"/>
               </w:rPr>
-              <w:t>ПШВ3х2</w:t>
+              <w:t>ШК2,5×2</w:t>
             </w:r>
           </w:p>
         </w:tc>
@@ -923,7 +905,6 @@
                 <w:sz w:val="22"/>
                 <w:szCs w:val="22"/>
               </w:rPr>
-              <w:t>20</w:t>
             </w:r>
           </w:p>
         </w:tc>
@@ -940,9 +921,7 @@
                 <w:szCs w:val="22"/>
               </w:rPr>
             </w:pPr>
-            <w:r>
-              <w:t>7</w:t>
-            </w:r>
+            <w:r/>
           </w:p>
         </w:tc>
         <w:tc>
@@ -963,7 +942,6 @@
                 <w:sz w:val="22"/>
                 <w:szCs w:val="22"/>
               </w:rPr>
-              <w:t>не годен</w:t>
             </w:r>
           </w:p>
         </w:tc>
@@ -986,7 +964,6 @@
                 <w:sz w:val="22"/>
                 <w:szCs w:val="22"/>
               </w:rPr>
-              <w:t>100</w:t>
             </w:r>
           </w:p>
         </w:tc>
@@ -1008,267 +985,6 @@
                 <w:sz w:val="22"/>
                 <w:szCs w:val="22"/>
               </w:rPr>
-              <w:t>Примечание 2</w:t>
-            </w:r>
-          </w:p>
-        </w:tc>
-      </w:tr>
-      <w:tr>
-        <w:tc>
-          <w:tcPr>
-            <w:tcW w:w="1874" w:type="dxa"/>
-          </w:tcPr>
-          <w:p>
-            <w:pPr>
-              <w:rPr>
-                <w:rFonts w:ascii="Times New Roman" w:hAnsi="Times New Roman" w:cs="Times New Roman"/>
-                <w:sz w:val="22"/>
-                <w:szCs w:val="22"/>
-                <w:lang w:val="en-US"/>
-              </w:rPr>
-            </w:pPr>
-            <w:r>
-              <w:rPr>
-                <w:rFonts w:ascii="Times New Roman" w:hAnsi="Times New Roman" w:cs="Times New Roman"/>
-                <w:sz w:val="22"/>
-                <w:szCs w:val="22"/>
-                <w:lang w:val="en-US"/>
-              </w:rPr>
-              <w:t>C2 5</w:t>
-            </w:r>
-          </w:p>
-        </w:tc>
-        <w:tc>
-          <w:tcPr>
-            <w:tcW w:w="1356" w:type="dxa"/>
-          </w:tcPr>
-          <w:p>
-            <w:pPr>
-              <w:jc w:val="center"/>
-              <w:rPr>
-                <w:rFonts w:ascii="Times New Roman" w:hAnsi="Times New Roman" w:cs="Times New Roman"/>
-                <w:sz w:val="22"/>
-                <w:szCs w:val="22"/>
-                <w:lang w:val="en-US"/>
-              </w:rPr>
-            </w:pPr>
-            <w:r>
-              <w:rPr>
-                <w:rFonts w:ascii="Times New Roman" w:hAnsi="Times New Roman" w:cs="Times New Roman"/>
-                <w:sz w:val="22"/>
-                <w:szCs w:val="22"/>
-                <w:lang w:val="en-US"/>
-              </w:rPr>
-              <w:t>2 300x100</w:t>
-            </w:r>
-          </w:p>
-        </w:tc>
-        <w:tc>
-          <w:tcPr>
-            <w:tcW w:w="998" w:type="dxa"/>
-          </w:tcPr>
-          <w:p>
-            <w:pPr>
-              <w:jc w:val="center"/>
-              <w:rPr>
-                <w:rFonts w:ascii="Times New Roman" w:hAnsi="Times New Roman" w:cs="Times New Roman"/>
-                <w:sz w:val="22"/>
-                <w:szCs w:val="22"/>
-                <w:lang w:val="en-US"/>
-              </w:rPr>
-            </w:pPr>
-            <w:r>
-              <w:rPr>
-                <w:rFonts w:ascii="Times New Roman" w:hAnsi="Times New Roman" w:cs="Times New Roman"/>
-                <w:sz w:val="22"/>
-                <w:szCs w:val="22"/>
-                <w:lang w:val="en-US"/>
-              </w:rPr>
-              <w:t>61</w:t>
-            </w:r>
-          </w:p>
-        </w:tc>
-        <w:tc>
-          <w:tcPr>
-            <w:tcW w:w="1153" w:type="dxa"/>
-          </w:tcPr>
-          <w:p>
-            <w:pPr>
-              <w:jc w:val="center"/>
-              <w:rPr>
-                <w:rFonts w:ascii="Times New Roman" w:hAnsi="Times New Roman" w:cs="Times New Roman"/>
-                <w:sz w:val="22"/>
-                <w:szCs w:val="22"/>
-              </w:rPr>
-            </w:pPr>
-            <w:r>
-              <w:rPr>
-                <w:rFonts w:ascii="Times New Roman" w:hAnsi="Times New Roman" w:cs="Times New Roman"/>
-                <w:sz w:val="22"/>
-                <w:szCs w:val="22"/>
-                <w:lang w:val="en-US"/>
-              </w:rPr>
-              <w:t>0,4</w:t>
-            </w:r>
-            <w:r>
-              <w:rPr>
-                <w:rFonts w:ascii="Times New Roman" w:hAnsi="Times New Roman" w:cs="Times New Roman"/>
-                <w:sz w:val="22"/>
-                <w:szCs w:val="22"/>
-              </w:rPr>
-            </w:r>
-          </w:p>
-        </w:tc>
-        <w:tc>
-          <w:tcPr>
-            <w:tcW w:w="1276" w:type="dxa"/>
-          </w:tcPr>
-          <w:p>
-            <w:pPr>
-              <w:jc w:val="center"/>
-              <w:rPr>
-                <w:rFonts w:ascii="Times New Roman" w:hAnsi="Times New Roman" w:cs="Times New Roman"/>
-                <w:sz w:val="22"/>
-                <w:szCs w:val="22"/>
-              </w:rPr>
-            </w:pPr>
-            <w:r>
-              <w:rPr>
-                <w:rFonts w:ascii="Times New Roman" w:hAnsi="Times New Roman" w:cs="Times New Roman"/>
-                <w:sz w:val="22"/>
-                <w:szCs w:val="22"/>
-              </w:rPr>
-              <w:t>0,2</w:t>
-            </w:r>
-          </w:p>
-        </w:tc>
-        <w:tc>
-          <w:tcPr>
-            <w:tcW w:w="2409" w:type="dxa"/>
-          </w:tcPr>
-          <w:p>
-            <w:pPr>
-              <w:rPr>
-                <w:rFonts w:ascii="Times New Roman" w:hAnsi="Times New Roman" w:cs="Times New Roman"/>
-                <w:sz w:val="22"/>
-                <w:szCs w:val="22"/>
-              </w:rPr>
-            </w:pPr>
-            <w:r>
-              <w:rPr>
-                <w:rFonts w:ascii="Times New Roman" w:hAnsi="Times New Roman" w:cs="Times New Roman"/>
-                <w:sz w:val="22"/>
-                <w:szCs w:val="22"/>
-              </w:rPr>
-              <w:t>С6ПШВ2,5х0,8</w:t>
-            </w:r>
-          </w:p>
-        </w:tc>
-        <w:tc>
-          <w:tcPr>
-            <w:tcW w:w="994" w:type="dxa"/>
-          </w:tcPr>
-          <w:p>
-            <w:pPr>
-              <w:jc w:val="center"/>
-              <w:rPr>
-                <w:rFonts w:ascii="Times New Roman" w:hAnsi="Times New Roman" w:cs="Times New Roman"/>
-                <w:sz w:val="22"/>
-                <w:szCs w:val="22"/>
-              </w:rPr>
-            </w:pPr>
-            <w:r>
-              <w:rPr>
-                <w:rFonts w:ascii="Times New Roman" w:hAnsi="Times New Roman" w:cs="Times New Roman"/>
-                <w:sz w:val="22"/>
-                <w:szCs w:val="22"/>
-              </w:rPr>
-              <w:t>14</w:t>
-            </w:r>
-          </w:p>
-        </w:tc>
-        <w:tc>
-          <w:tcPr>
-            <w:tcW w:w="1275" w:type="dxa"/>
-          </w:tcPr>
-          <w:p>
-            <w:pPr>
-              <w:jc w:val="center"/>
-              <w:rPr>
-                <w:rFonts w:ascii="Times New Roman" w:hAnsi="Times New Roman" w:cs="Times New Roman"/>
-                <w:sz w:val="22"/>
-                <w:szCs w:val="22"/>
-              </w:rPr>
-            </w:pPr>
-            <w:r>
-              <w:t>4</w:t>
-            </w:r>
-          </w:p>
-        </w:tc>
-        <w:tc>
-          <w:tcPr>
-            <w:tcW w:w="1418" w:type="dxa"/>
-          </w:tcPr>
-          <w:p>
-            <w:pPr>
-              <w:rPr>
-                <w:rFonts w:ascii="Times New Roman" w:hAnsi="Times New Roman" w:cs="Times New Roman"/>
-                <w:sz w:val="22"/>
-                <w:szCs w:val="22"/>
-              </w:rPr>
-            </w:pPr>
-            <w:r>
-              <w:rPr>
-                <w:rFonts w:ascii="Times New Roman" w:hAnsi="Times New Roman" w:cs="Times New Roman"/>
-                <w:sz w:val="22"/>
-                <w:szCs w:val="22"/>
-              </w:rPr>
-              <w:t>годен</w:t>
-            </w:r>
-          </w:p>
-        </w:tc>
-        <w:tc>
-          <w:tcPr>
-            <w:tcW w:w="1150" w:type="dxa"/>
-          </w:tcPr>
-          <w:p>
-            <w:pPr>
-              <w:jc w:val="center"/>
-              <w:rPr>
-                <w:rFonts w:ascii="Times New Roman" w:hAnsi="Times New Roman" w:cs="Times New Roman"/>
-                <w:sz w:val="22"/>
-                <w:szCs w:val="22"/>
-              </w:rPr>
-            </w:pPr>
-            <w:r>
-              <w:rPr>
-                <w:rFonts w:ascii="Times New Roman" w:hAnsi="Times New Roman" w:cs="Times New Roman"/>
-                <w:sz w:val="22"/>
-                <w:szCs w:val="22"/>
-              </w:rPr>
-              <w:t>100</w:t>
-            </w:r>
-          </w:p>
-        </w:tc>
-        <w:tc>
-          <w:tcPr>
-            <w:tcW w:w="1685" w:type="dxa"/>
-          </w:tcPr>
-          <w:p>
-            <w:pPr>
-              <w:rPr>
-                <w:rFonts w:ascii="Times New Roman" w:hAnsi="Times New Roman" w:cs="Times New Roman"/>
-                <w:sz w:val="22"/>
-                <w:szCs w:val="22"/>
-              </w:rPr>
-            </w:pPr>
-            <w:r>
-              <w:rPr>
-                <w:rFonts w:ascii="Times New Roman" w:hAnsi="Times New Roman" w:cs="Times New Roman"/>
-                <w:sz w:val="22"/>
-                <w:szCs w:val="22"/>
-              </w:rPr>
-              <w:t>Примечание 3</w:t>
             </w:r>
           </w:p>
         </w:tc>
@@ -1286,7 +1002,7 @@
         <w:rPr>
           <w:rFonts w:ascii="Times New Roman" w:hAnsi="Times New Roman" w:cs="Times New Roman"/>
         </w:rPr>
-        <w:t>Заключение лаборатории: По результатам контроля дефекты занесены в таблицу ниже.</w:t>
+        <w:t>Заключение лаборатории: все тут хорошо только два дефекта есть</w:t>
       </w:r>
     </w:p>
     <w:p>
@@ -1368,7 +1084,7 @@
         <w:rPr>
           <w:rFonts w:ascii="Times New Roman" w:hAnsi="Times New Roman" w:cs="Times New Roman"/>
         </w:rPr>
-        <w:t>Дефектоскопист Петров П.П.</w:t>
+        <w:t>Дефектоскопист Иванов И.И.</w:t>
       </w:r>
       <w:r>
         <w:rPr>
@@ -1437,7 +1153,7 @@
         <w:rPr>
           <w:rFonts w:ascii="Times New Roman" w:hAnsi="Times New Roman" w:cs="Times New Roman"/>
         </w:rPr>
-        <w:t xml:space="preserve">    20.04.2026</w:t>
+        <w:t xml:space="preserve">    25.04.2026</w:t>
       </w:r>
     </w:p>
     <w:sectPr>

</xml_diff>